<commit_message>
refine README and resume_search.md for clarity; update output file naming conventions and enhance professional experience descriptions
</commit_message>
<xml_diff>
--- a/resume/other_formats/resume_search_20251213.docx
+++ b/resume/other_formats/resume_search_20251213.docx
@@ -100,11 +100,489 @@
         <w:pStyle w:val="FirstParagraph"/>
       </w:pPr>
       <w:r>
-        <w:t xml:space="preserve">Passionate and accomplished Machine Learning Professional with a decade of hands-on expertise in</w:t>
+        <w:t xml:space="preserve">Accomplished Machine Learning Professional with a decade of experience in Generative AI, LLMs, VLM, NLP, and Computer Vision. Proven leader in building and deploying innovative AI solutions, driving business impact, and mentoring high-performing teams. Passionate about solving complex problems and delivering state-of-the-art results.</w:t>
+      </w:r>
+    </w:p>
+    <w:p>
+      <w:r>
+        <w:pict>
+          <v:rect style="width:0;height:1.5pt" o:hralign="center" o:hrstd="t" o:hr="t"/>
+        </w:pict>
+      </w:r>
+    </w:p>
+    <w:bookmarkEnd w:id="22"/>
+    <w:bookmarkStart w:id="35" w:name="professional-experience"/>
+    <w:p>
+      <w:pPr>
+        <w:pStyle w:val="Heading2"/>
+      </w:pPr>
+      <w:r>
+        <w:t xml:space="preserve">Professional Experience</w:t>
+      </w:r>
+    </w:p>
+    <w:bookmarkStart w:id="26" w:name="Xdff40fd0d2a85bb560d1bda275f5eba3f147758"/>
+    <w:p>
+      <w:pPr>
+        <w:pStyle w:val="Heading3"/>
+      </w:pPr>
+      <w:r>
+        <w:t xml:space="preserve">Sr AI Engineer - Target Corporation</w:t>
       </w:r>
       <w:r>
         <w:t xml:space="preserve"> </w:t>
       </w:r>
+      <w:r>
+        <w:t xml:space="preserve">(Feb 2021 – Present)</w:t>
+      </w:r>
+    </w:p>
+    <w:p>
+      <w:pPr>
+        <w:pStyle w:val="Compact"/>
+        <w:numPr>
+          <w:ilvl w:val="0"/>
+          <w:numId w:val="1001"/>
+        </w:numPr>
+      </w:pPr>
+      <w:r>
+        <w:t xml:space="preserve">Led cross-functional teams to design and implement scalable ML solutions aligned with business goals.</w:t>
+      </w:r>
+    </w:p>
+    <w:p>
+      <w:pPr>
+        <w:pStyle w:val="Compact"/>
+        <w:numPr>
+          <w:ilvl w:val="0"/>
+          <w:numId w:val="1001"/>
+        </w:numPr>
+      </w:pPr>
+      <w:r>
+        <w:t xml:space="preserve">Provided technical leadership in ML architecture, model selection, and productionization.</w:t>
+      </w:r>
+    </w:p>
+    <w:p>
+      <w:pPr>
+        <w:pStyle w:val="Compact"/>
+        <w:numPr>
+          <w:ilvl w:val="0"/>
+          <w:numId w:val="1001"/>
+        </w:numPr>
+      </w:pPr>
+      <w:r>
+        <w:t xml:space="preserve">Mentored Data Scientists and ML Engineers, fostering technical growth and best practices.</w:t>
+      </w:r>
+    </w:p>
+    <w:p>
+      <w:pPr>
+        <w:pStyle w:val="Compact"/>
+        <w:numPr>
+          <w:ilvl w:val="0"/>
+          <w:numId w:val="1001"/>
+        </w:numPr>
+      </w:pPr>
+      <w:r>
+        <w:t xml:space="preserve">Developed and optimized advanced ML models, reducing embedding computation latency for large-scale datasets.</w:t>
+      </w:r>
+    </w:p>
+    <w:p>
+      <w:pPr>
+        <w:pStyle w:val="Compact"/>
+        <w:numPr>
+          <w:ilvl w:val="0"/>
+          <w:numId w:val="1001"/>
+        </w:numPr>
+      </w:pPr>
+      <w:r>
+        <w:t xml:space="preserve">Established robust model development, evaluation, and deployment workflows.</w:t>
+      </w:r>
+    </w:p>
+    <w:bookmarkStart w:id="23" w:name="agentic-doc-entity-extraction"/>
+    <w:p>
+      <w:pPr>
+        <w:pStyle w:val="Heading4"/>
+      </w:pPr>
+      <w:r>
+        <w:t xml:space="preserve">Agentic Doc Entity Extraction</w:t>
+      </w:r>
+    </w:p>
+    <w:p>
+      <w:pPr>
+        <w:pStyle w:val="Compact"/>
+        <w:numPr>
+          <w:ilvl w:val="0"/>
+          <w:numId w:val="1002"/>
+        </w:numPr>
+      </w:pPr>
+      <w:r>
+        <w:t xml:space="preserve">Automated invoice processing by integrating agent-based tools in the MCP Server.</w:t>
+      </w:r>
+    </w:p>
+    <w:p>
+      <w:pPr>
+        <w:pStyle w:val="Compact"/>
+        <w:numPr>
+          <w:ilvl w:val="1"/>
+          <w:numId w:val="1003"/>
+        </w:numPr>
+      </w:pPr>
+      <w:r>
+        <w:t xml:space="preserve">Deployed Image Anomaly Agent to detect quality issues and trigger targeted preprocessing.</w:t>
+      </w:r>
+    </w:p>
+    <w:p>
+      <w:pPr>
+        <w:pStyle w:val="Compact"/>
+        <w:numPr>
+          <w:ilvl w:val="1"/>
+          <w:numId w:val="1003"/>
+        </w:numPr>
+      </w:pPr>
+      <w:r>
+        <w:t xml:space="preserve">Implemented document layout and OCR agents for adaptive document analysis.</w:t>
+      </w:r>
+    </w:p>
+    <w:p>
+      <w:pPr>
+        <w:pStyle w:val="Compact"/>
+        <w:numPr>
+          <w:ilvl w:val="1"/>
+          <w:numId w:val="1003"/>
+        </w:numPr>
+      </w:pPr>
+      <w:r>
+        <w:t xml:space="preserve">Built Entity Linking &amp; Validation Agents to extract, connect, and validate invoice data with enterprise systems.</w:t>
+      </w:r>
+    </w:p>
+    <w:bookmarkEnd w:id="23"/>
+    <w:bookmarkStart w:id="24" w:name="rag-powered-invoice-intelligence-system"/>
+    <w:p>
+      <w:pPr>
+        <w:pStyle w:val="Heading4"/>
+      </w:pPr>
+      <w:r>
+        <w:t xml:space="preserve">RAG powered Invoice Intelligence System</w:t>
+      </w:r>
+    </w:p>
+    <w:p>
+      <w:pPr>
+        <w:pStyle w:val="Compact"/>
+        <w:numPr>
+          <w:ilvl w:val="0"/>
+          <w:numId w:val="1004"/>
+        </w:numPr>
+      </w:pPr>
+      <w:r>
+        <w:t xml:space="preserve">Architected and deployed a scalable invoice search platform using LLM-powered RAG, Milvus, and Elasticsearch, handling millions of financial documents.</w:t>
+      </w:r>
+    </w:p>
+    <w:p>
+      <w:pPr>
+        <w:pStyle w:val="Compact"/>
+        <w:numPr>
+          <w:ilvl w:val="0"/>
+          <w:numId w:val="1004"/>
+        </w:numPr>
+      </w:pPr>
+      <w:r>
+        <w:t xml:space="preserve">Engineered a hybrid search strategy combining structured filtering and semantic vector search for high-precision retrieval.</w:t>
+      </w:r>
+    </w:p>
+    <w:p>
+      <w:pPr>
+        <w:pStyle w:val="Compact"/>
+        <w:numPr>
+          <w:ilvl w:val="0"/>
+          <w:numId w:val="1004"/>
+        </w:numPr>
+      </w:pPr>
+      <w:r>
+        <w:t xml:space="preserve">Selected and tuned models (OCR, CLIP, LayoutLM, SentenceTransformers), reducing manual invoice processing by 70%.</w:t>
+      </w:r>
+    </w:p>
+    <w:bookmarkEnd w:id="24"/>
+    <w:bookmarkStart w:id="25" w:name="ai-powered-asset-tagging-system"/>
+    <w:p>
+      <w:pPr>
+        <w:pStyle w:val="Heading4"/>
+      </w:pPr>
+      <w:r>
+        <w:t xml:space="preserve">AI-Powered Asset Tagging System</w:t>
+      </w:r>
+    </w:p>
+    <w:p>
+      <w:pPr>
+        <w:pStyle w:val="Compact"/>
+        <w:numPr>
+          <w:ilvl w:val="0"/>
+          <w:numId w:val="1005"/>
+        </w:numPr>
+      </w:pPr>
+      <w:r>
+        <w:t xml:space="preserve">Designed and delivered an enterprise-grade asset tagging and search system supporting semantic and hybrid queries over millions of assets.</w:t>
+      </w:r>
+    </w:p>
+    <w:p>
+      <w:pPr>
+        <w:pStyle w:val="Compact"/>
+        <w:numPr>
+          <w:ilvl w:val="0"/>
+          <w:numId w:val="1005"/>
+        </w:numPr>
+      </w:pPr>
+      <w:r>
+        <w:t xml:space="preserve">Built a metadata enrichment pipeline using OCR, object detection, and logo recognition for improved indexing.</w:t>
+      </w:r>
+    </w:p>
+    <w:p>
+      <w:pPr>
+        <w:pStyle w:val="Compact"/>
+        <w:numPr>
+          <w:ilvl w:val="0"/>
+          <w:numId w:val="1005"/>
+        </w:numPr>
+      </w:pPr>
+      <w:r>
+        <w:t xml:space="preserve">Developed a multi-modal retrieval pipeline leveraging CLIP and Sentence-BERT, boosting searchability by 40%.</w:t>
+      </w:r>
+    </w:p>
+    <w:p>
+      <w:pPr>
+        <w:pStyle w:val="Compact"/>
+        <w:numPr>
+          <w:ilvl w:val="0"/>
+          <w:numId w:val="1005"/>
+        </w:numPr>
+      </w:pPr>
+      <w:r>
+        <w:t xml:space="preserve">Implemented high-throughput batch and incremental asset tagging with Kafka, Spark, and distributed inference.</w:t>
+      </w:r>
+    </w:p>
+    <w:bookmarkEnd w:id="25"/>
+    <w:bookmarkEnd w:id="26"/>
+    <w:bookmarkStart w:id="28" w:name="X71b90da7175cee9ab1010bbd75ad27314c76116"/>
+    <w:p>
+      <w:pPr>
+        <w:pStyle w:val="Heading3"/>
+      </w:pPr>
+      <w:r>
+        <w:t xml:space="preserve">Senior Data Scientist - Embibe</w:t>
+      </w:r>
+      <w:r>
+        <w:t xml:space="preserve"> </w:t>
+      </w:r>
+      <w:r>
+        <w:t xml:space="preserve">(May 2019 – Jan 2021)</w:t>
+      </w:r>
+    </w:p>
+    <w:bookmarkStart w:id="27" w:name="X14ab821c86a15a7eb7453d92fa88febf6825235"/>
+    <w:p>
+      <w:pPr>
+        <w:pStyle w:val="Heading4"/>
+      </w:pPr>
+      <w:r>
+        <w:t xml:space="preserve">Question Tagging and Topic Extraction System</w:t>
+      </w:r>
+    </w:p>
+    <w:p>
+      <w:pPr>
+        <w:pStyle w:val="Compact"/>
+        <w:numPr>
+          <w:ilvl w:val="0"/>
+          <w:numId w:val="1006"/>
+        </w:numPr>
+      </w:pPr>
+      <w:r>
+        <w:t xml:space="preserve">Built automated systems for question tagging and topic extraction using BERT and ResNet, improving content recommendation and search.</w:t>
+      </w:r>
+    </w:p>
+    <w:bookmarkEnd w:id="27"/>
+    <w:bookmarkEnd w:id="28"/>
+    <w:bookmarkStart w:id="31" w:name="Xd007bc3e7254f62f7ad0f1e7722b47fa2fddee9"/>
+    <w:p>
+      <w:pPr>
+        <w:pStyle w:val="Heading3"/>
+      </w:pPr>
+      <w:r>
+        <w:t xml:space="preserve">Senior Data Scientist - ClipIndia</w:t>
+      </w:r>
+      <w:r>
+        <w:t xml:space="preserve"> </w:t>
+      </w:r>
+      <w:r>
+        <w:t xml:space="preserve">(Sep 2018 – Apr 2019)</w:t>
+      </w:r>
+    </w:p>
+    <w:bookmarkStart w:id="29" w:name="nsfw-video-classification"/>
+    <w:p>
+      <w:pPr>
+        <w:pStyle w:val="Heading4"/>
+      </w:pPr>
+      <w:r>
+        <w:t xml:space="preserve">NSFW Video Classification</w:t>
+      </w:r>
+    </w:p>
+    <w:p>
+      <w:pPr>
+        <w:pStyle w:val="Compact"/>
+        <w:numPr>
+          <w:ilvl w:val="0"/>
+          <w:numId w:val="1007"/>
+        </w:numPr>
+      </w:pPr>
+      <w:r>
+        <w:t xml:space="preserve">Developed and deployed a video classification system, reducing inappropriate content by 28%.</w:t>
+      </w:r>
+    </w:p>
+    <w:bookmarkEnd w:id="29"/>
+    <w:bookmarkStart w:id="30" w:name="video-asset-tagging"/>
+    <w:p>
+      <w:pPr>
+        <w:pStyle w:val="Heading4"/>
+      </w:pPr>
+      <w:r>
+        <w:t xml:space="preserve">Video Asset Tagging</w:t>
+      </w:r>
+    </w:p>
+    <w:p>
+      <w:pPr>
+        <w:pStyle w:val="Compact"/>
+        <w:numPr>
+          <w:ilvl w:val="0"/>
+          <w:numId w:val="1008"/>
+        </w:numPr>
+      </w:pPr>
+      <w:r>
+        <w:t xml:space="preserve">Built a tagging system that improved content discoverability and increased user engagement by 3%.</w:t>
+      </w:r>
+    </w:p>
+    <w:bookmarkEnd w:id="30"/>
+    <w:bookmarkEnd w:id="31"/>
+    <w:bookmarkStart w:id="33" w:name="X69779b265433201edcbb6142ec1a9b144fc8694"/>
+    <w:p>
+      <w:pPr>
+        <w:pStyle w:val="Heading3"/>
+      </w:pPr>
+      <w:r>
+        <w:t xml:space="preserve">Senior Data Scientist - Cogknit Semantics</w:t>
+      </w:r>
+      <w:r>
+        <w:t xml:space="preserve"> </w:t>
+      </w:r>
+      <w:r>
+        <w:t xml:space="preserve">(Sep 2015 – Sep 2018)</w:t>
+      </w:r>
+    </w:p>
+    <w:bookmarkStart w:id="32" w:name="Xe9962d98aa185d19331d026ed8f6b2c92a36476"/>
+    <w:p>
+      <w:pPr>
+        <w:pStyle w:val="Heading4"/>
+      </w:pPr>
+      <w:r>
+        <w:t xml:space="preserve">Digital Catalogue Misplaced Product Detection</w:t>
+      </w:r>
+    </w:p>
+    <w:p>
+      <w:pPr>
+        <w:pStyle w:val="Compact"/>
+        <w:numPr>
+          <w:ilvl w:val="0"/>
+          <w:numId w:val="1009"/>
+        </w:numPr>
+      </w:pPr>
+      <w:r>
+        <w:t xml:space="preserve">Developed a CV-based system using CNNs to detect and correct misplaced products, reducing catalog errors by 12%.</w:t>
+      </w:r>
+    </w:p>
+    <w:bookmarkEnd w:id="32"/>
+    <w:bookmarkEnd w:id="33"/>
+    <w:bookmarkStart w:id="34" w:name="X5003e9462c62621044354b450e52d68e7d3c29c"/>
+    <w:p>
+      <w:pPr>
+        <w:pStyle w:val="Heading3"/>
+      </w:pPr>
+      <w:r>
+        <w:t xml:space="preserve">Sr. Research Analyst - Edureka</w:t>
+      </w:r>
+      <w:r>
+        <w:t xml:space="preserve"> </w:t>
+      </w:r>
+      <w:r>
+        <w:t xml:space="preserve">(Dec 2013 – Sep 2015)</w:t>
+      </w:r>
+    </w:p>
+    <w:p>
+      <w:pPr>
+        <w:pStyle w:val="Compact"/>
+        <w:numPr>
+          <w:ilvl w:val="0"/>
+          <w:numId w:val="1010"/>
+        </w:numPr>
+      </w:pPr>
+      <w:r>
+        <w:t xml:space="preserve">Created a comprehensive knowledge base, reducing TA team workload and improving support and learning resources.</w:t>
+      </w:r>
+    </w:p>
+    <w:p>
+      <w:r>
+        <w:pict>
+          <v:rect style="width:0;height:1.5pt" o:hralign="center" o:hrstd="t" o:hr="t"/>
+        </w:pict>
+      </w:r>
+    </w:p>
+    <w:bookmarkEnd w:id="34"/>
+    <w:bookmarkEnd w:id="35"/>
+    <w:bookmarkStart w:id="36" w:name="education"/>
+    <w:p>
+      <w:pPr>
+        <w:pStyle w:val="Heading2"/>
+      </w:pPr>
+      <w:r>
+        <w:t xml:space="preserve">Education</w:t>
+      </w:r>
+    </w:p>
+    <w:p>
+      <w:pPr>
+        <w:pStyle w:val="Compact"/>
+        <w:numPr>
+          <w:ilvl w:val="0"/>
+          <w:numId w:val="1011"/>
+        </w:numPr>
+      </w:pPr>
+      <w:r>
+        <w:rPr>
+          <w:b/>
+          <w:bCs/>
+        </w:rPr>
+        <w:t xml:space="preserve">Bachelor in Computer Science</w:t>
+      </w:r>
+      <w:r>
+        <w:t xml:space="preserve">, Visvesvaraya Technological University (VTU), 2013.</w:t>
+      </w:r>
+    </w:p>
+    <w:p>
+      <w:r>
+        <w:pict>
+          <v:rect style="width:0;height:1.5pt" o:hralign="center" o:hrstd="t" o:hr="t"/>
+        </w:pict>
+      </w:r>
+    </w:p>
+    <w:bookmarkEnd w:id="36"/>
+    <w:bookmarkStart w:id="37" w:name="skills"/>
+    <w:p>
+      <w:pPr>
+        <w:pStyle w:val="Heading2"/>
+      </w:pPr>
+      <w:r>
+        <w:t xml:space="preserve">Skills</w:t>
+      </w:r>
+    </w:p>
+    <w:p>
+      <w:pPr>
+        <w:pStyle w:val="Compact"/>
+        <w:numPr>
+          <w:ilvl w:val="0"/>
+          <w:numId w:val="1012"/>
+        </w:numPr>
+      </w:pPr>
       <w:r>
         <w:rPr>
           <w:b/>
@@ -113,37 +591,55 @@
         <w:t xml:space="preserve">Generative AI</w:t>
       </w:r>
       <w:r>
-        <w:t xml:space="preserve">,</w:t>
-      </w:r>
-      <w:r>
-        <w:t xml:space="preserve"> </w:t>
-      </w:r>
+        <w:t xml:space="preserve">: Prompt engineering, LLM app development, AI Agents, RAG, ChatGPT, Bert, LLAMA, CrewAI, LangChain</w:t>
+      </w:r>
+    </w:p>
+    <w:p>
+      <w:pPr>
+        <w:pStyle w:val="Compact"/>
+        <w:numPr>
+          <w:ilvl w:val="0"/>
+          <w:numId w:val="1012"/>
+        </w:numPr>
+      </w:pPr>
       <w:r>
         <w:rPr>
           <w:b/>
           <w:bCs/>
         </w:rPr>
-        <w:t xml:space="preserve">LLM</w:t>
-      </w:r>
-      <w:r>
-        <w:t xml:space="preserve">,</w:t>
-      </w:r>
-      <w:r>
-        <w:t xml:space="preserve"> </w:t>
-      </w:r>
+        <w:t xml:space="preserve">Search Systems</w:t>
+      </w:r>
+      <w:r>
+        <w:t xml:space="preserve">: Elasticsearch, Milvus, FAISS</w:t>
+      </w:r>
+    </w:p>
+    <w:p>
+      <w:pPr>
+        <w:pStyle w:val="Compact"/>
+        <w:numPr>
+          <w:ilvl w:val="0"/>
+          <w:numId w:val="1012"/>
+        </w:numPr>
+      </w:pPr>
       <w:r>
         <w:rPr>
           <w:b/>
           <w:bCs/>
         </w:rPr>
-        <w:t xml:space="preserve">VLM</w:t>
-      </w:r>
-      <w:r>
-        <w:t xml:space="preserve">,</w:t>
-      </w:r>
-      <w:r>
-        <w:t xml:space="preserve"> </w:t>
-      </w:r>
+        <w:t xml:space="preserve">Computer Vision</w:t>
+      </w:r>
+      <w:r>
+        <w:t xml:space="preserve">: Object detection, image classification, segmentation</w:t>
+      </w:r>
+    </w:p>
+    <w:p>
+      <w:pPr>
+        <w:pStyle w:val="Compact"/>
+        <w:numPr>
+          <w:ilvl w:val="0"/>
+          <w:numId w:val="1012"/>
+        </w:numPr>
+      </w:pPr>
       <w:r>
         <w:rPr>
           <w:b/>
@@ -152,679 +648,7 @@
         <w:t xml:space="preserve">NLP</w:t>
       </w:r>
       <w:r>
-        <w:t xml:space="preserve">,</w:t>
-      </w:r>
-      <w:r>
-        <w:t xml:space="preserve"> </w:t>
-      </w:r>
-      <w:r>
-        <w:rPr>
-          <w:b/>
-          <w:bCs/>
-        </w:rPr>
-        <w:t xml:space="preserve">Computer Vision</w:t>
-      </w:r>
-      <w:r>
-        <w:t xml:space="preserve"> </w:t>
-      </w:r>
-      <w:r>
-        <w:t xml:space="preserve">and solving complex problems. Proven track record of leading teams, engaging with clients, and contributing impactful research to the field. A dedicated individual with a passion for innovation and a drive to deliver cutting-edge solutions.</w:t>
-      </w:r>
-    </w:p>
-    <w:p>
-      <w:r>
-        <w:pict>
-          <v:rect style="width:0;height:1.5pt" o:hralign="center" o:hrstd="t" o:hr="t"/>
-        </w:pict>
-      </w:r>
-    </w:p>
-    <w:bookmarkEnd w:id="22"/>
-    <w:bookmarkStart w:id="35" w:name="professional-experience"/>
-    <w:p>
-      <w:pPr>
-        <w:pStyle w:val="Heading2"/>
-      </w:pPr>
-      <w:r>
-        <w:t xml:space="preserve">Professional Experience</w:t>
-      </w:r>
-    </w:p>
-    <w:bookmarkStart w:id="26" w:name="Xdff40fd0d2a85bb560d1bda275f5eba3f147758"/>
-    <w:p>
-      <w:pPr>
-        <w:pStyle w:val="Heading3"/>
-      </w:pPr>
-      <w:r>
-        <w:t xml:space="preserve">Sr AI Engineer - Target Corporation</w:t>
-      </w:r>
-      <w:r>
-        <w:t xml:space="preserve"> </w:t>
-      </w:r>
-      <w:r>
-        <w:t xml:space="preserve">(Feb 2021 – Present)</w:t>
-      </w:r>
-    </w:p>
-    <w:p>
-      <w:pPr>
-        <w:pStyle w:val="Compact"/>
-        <w:numPr>
-          <w:ilvl w:val="0"/>
-          <w:numId w:val="1001"/>
-        </w:numPr>
-      </w:pPr>
-      <w:r>
-        <w:t xml:space="preserve">Collaborated with cross-functional teams to design and implement solutions that address business needs and drive value for the organization.</w:t>
-      </w:r>
-    </w:p>
-    <w:p>
-      <w:pPr>
-        <w:pStyle w:val="Compact"/>
-        <w:numPr>
-          <w:ilvl w:val="0"/>
-          <w:numId w:val="1001"/>
-        </w:numPr>
-      </w:pPr>
-      <w:r>
-        <w:t xml:space="preserve">Provided technical leadership on ML architecture, model selection, and productionisation, ensuring scalability and alignment with business objectives.</w:t>
-      </w:r>
-    </w:p>
-    <w:p>
-      <w:pPr>
-        <w:pStyle w:val="Compact"/>
-        <w:numPr>
-          <w:ilvl w:val="0"/>
-          <w:numId w:val="1001"/>
-        </w:numPr>
-      </w:pPr>
-      <w:r>
-        <w:t xml:space="preserve">Led a team of Data Scientists and Machine Learning Engineers, providing mentorship and guidance to enhance their technical skills and professional development.</w:t>
-      </w:r>
-    </w:p>
-    <w:p>
-      <w:pPr>
-        <w:pStyle w:val="Compact"/>
-        <w:numPr>
-          <w:ilvl w:val="0"/>
-          <w:numId w:val="1001"/>
-        </w:numPr>
-      </w:pPr>
-      <w:r>
-        <w:t xml:space="preserve">Developed and implemented best practices for model development, evaluation, and deployment, ensuring high-quality and scalable Machine Learning solutions.</w:t>
-      </w:r>
-    </w:p>
-    <w:p>
-      <w:pPr>
-        <w:pStyle w:val="Compact"/>
-        <w:numPr>
-          <w:ilvl w:val="0"/>
-          <w:numId w:val="1001"/>
-        </w:numPr>
-      </w:pPr>
-      <w:r>
-        <w:t xml:space="preserve">Led the development of innovative Machine Learning models and algorithms, leveraging cutting-edge techniques and technologies to solve complex business problems.</w:t>
-      </w:r>
-    </w:p>
-    <w:p>
-      <w:pPr>
-        <w:pStyle w:val="Compact"/>
-        <w:numPr>
-          <w:ilvl w:val="0"/>
-          <w:numId w:val="1001"/>
-        </w:numPr>
-      </w:pPr>
-      <w:r>
-        <w:t xml:space="preserve">Led model optimization efforts, reducing embedding computation latency for large-scale datasets.</w:t>
-      </w:r>
-    </w:p>
-    <w:p>
-      <w:pPr>
-        <w:pStyle w:val="Compact"/>
-        <w:numPr>
-          <w:ilvl w:val="0"/>
-          <w:numId w:val="1001"/>
-        </w:numPr>
-      </w:pPr>
-      <w:r>
-        <w:t xml:space="preserve">Conducted regular code reviews and technical discussions to ensure the team's adherence to coding standards and best practices.</w:t>
-      </w:r>
-    </w:p>
-    <w:bookmarkStart w:id="23" w:name="agentic-doc-entity-extraction"/>
-    <w:p>
-      <w:pPr>
-        <w:pStyle w:val="Heading4"/>
-      </w:pPr>
-      <w:r>
-        <w:t xml:space="preserve">Agentic Doc Entity Extraction</w:t>
-      </w:r>
-    </w:p>
-    <w:p>
-      <w:pPr>
-        <w:pStyle w:val="Compact"/>
-        <w:numPr>
-          <w:ilvl w:val="0"/>
-          <w:numId w:val="1002"/>
-        </w:numPr>
-      </w:pPr>
-      <w:r>
-        <w:t xml:space="preserve">Added Agents with set of tools to automate various invoice tasks</w:t>
-      </w:r>
-    </w:p>
-    <w:p>
-      <w:pPr>
-        <w:pStyle w:val="Compact"/>
-        <w:numPr>
-          <w:ilvl w:val="0"/>
-          <w:numId w:val="1002"/>
-        </w:numPr>
-      </w:pPr>
-      <w:r>
-        <w:t xml:space="preserve">Hosted and integrated various tools in MCP Server for invoice automation</w:t>
-      </w:r>
-    </w:p>
-    <w:p>
-      <w:pPr>
-        <w:pStyle w:val="Compact"/>
-        <w:numPr>
-          <w:ilvl w:val="1"/>
-          <w:numId w:val="1003"/>
-        </w:numPr>
-      </w:pPr>
-      <w:r>
-        <w:t xml:space="preserve">Added Image Anomaly Agent to classify quality issues (blur, rotation, compression artifacts) to trigger the right preprocessing steps (denoise, rotate, deskew, resolution enhancement or discard).</w:t>
-      </w:r>
-    </w:p>
-    <w:p>
-      <w:pPr>
-        <w:pStyle w:val="Compact"/>
-        <w:numPr>
-          <w:ilvl w:val="1"/>
-          <w:numId w:val="1003"/>
-        </w:numPr>
-      </w:pPr>
-      <w:r>
-        <w:t xml:space="preserve">Added doc layout analysis agent which calls right tools based on doc type</w:t>
-      </w:r>
-    </w:p>
-    <w:p>
-      <w:pPr>
-        <w:pStyle w:val="Compact"/>
-        <w:numPr>
-          <w:ilvl w:val="1"/>
-          <w:numId w:val="1003"/>
-        </w:numPr>
-      </w:pPr>
-      <w:r>
-        <w:t xml:space="preserve">Added OCR Agent which calls right OCR tools based on text type in doc</w:t>
-      </w:r>
-    </w:p>
-    <w:p>
-      <w:pPr>
-        <w:pStyle w:val="Compact"/>
-        <w:numPr>
-          <w:ilvl w:val="1"/>
-          <w:numId w:val="1003"/>
-        </w:numPr>
-      </w:pPr>
-      <w:r>
-        <w:t xml:space="preserve">Added Entity Linking &amp; Validation Agents which extract entities, connect invoice values to enterprise systems (registered as tools), and validate them</w:t>
-      </w:r>
-    </w:p>
-    <w:bookmarkEnd w:id="23"/>
-    <w:bookmarkStart w:id="24" w:name="rag-powered-invoice-intelligence-system"/>
-    <w:p>
-      <w:pPr>
-        <w:pStyle w:val="Heading4"/>
-      </w:pPr>
-      <w:r>
-        <w:t xml:space="preserve">RAG powered Invoice Intelligence System</w:t>
-      </w:r>
-    </w:p>
-    <w:p>
-      <w:pPr>
-        <w:pStyle w:val="Compact"/>
-        <w:numPr>
-          <w:ilvl w:val="0"/>
-          <w:numId w:val="1004"/>
-        </w:numPr>
-      </w:pPr>
-      <w:r>
-        <w:t xml:space="preserve">Architected and deployed a scalable invoice search system combining LLM-powered RAG with high-performance vector search (Milvus) and Elasticsearch, handling over millions of financial documents.</w:t>
-      </w:r>
-    </w:p>
-    <w:p>
-      <w:pPr>
-        <w:pStyle w:val="Compact"/>
-        <w:numPr>
-          <w:ilvl w:val="0"/>
-          <w:numId w:val="1004"/>
-        </w:numPr>
-      </w:pPr>
-      <w:r>
-        <w:t xml:space="preserve">Engineered a hybrid search strategy, combining structured field-based filtering (Elasticsearch) with semantic vector search (Milvus) for high-precision invoice retrieval.</w:t>
-      </w:r>
-    </w:p>
-    <w:p>
-      <w:pPr>
-        <w:pStyle w:val="Compact"/>
-        <w:numPr>
-          <w:ilvl w:val="0"/>
-          <w:numId w:val="1004"/>
-        </w:numPr>
-      </w:pPr>
-      <w:r>
-        <w:t xml:space="preserve">Spearheaded the selection and tuning of models (OCR, CLIP, LayoutLM, SentenceTransformers) for extracting structured and unstructured metadata, reducing manual effort in invoice processing by 70%.</w:t>
-      </w:r>
-    </w:p>
-    <w:bookmarkEnd w:id="24"/>
-    <w:bookmarkStart w:id="25" w:name="ai-powered-asset-tagging-system"/>
-    <w:p>
-      <w:pPr>
-        <w:pStyle w:val="Heading4"/>
-      </w:pPr>
-      <w:r>
-        <w:t xml:space="preserve">AI-Powered Asset Tagging System</w:t>
-      </w:r>
-    </w:p>
-    <w:p>
-      <w:pPr>
-        <w:pStyle w:val="Compact"/>
-        <w:numPr>
-          <w:ilvl w:val="0"/>
-          <w:numId w:val="1005"/>
-        </w:numPr>
-      </w:pPr>
-      <w:r>
-        <w:t xml:space="preserve">Designed and led the development of an enterprise-grade AI-powered asset tagging and search system, enabling semantic and hybrid search over millions of assets, enabling search by images and natural language</w:t>
-      </w:r>
-    </w:p>
-    <w:p>
-      <w:pPr>
-        <w:pStyle w:val="Compact"/>
-        <w:numPr>
-          <w:ilvl w:val="0"/>
-          <w:numId w:val="1005"/>
-        </w:numPr>
-      </w:pPr>
-      <w:r>
-        <w:t xml:space="preserve">Developed a metadata enrichment pipeline using OCR, object detection, and brand/logo recognition models, generating structured metadata for improved indexing and search.</w:t>
-      </w:r>
-    </w:p>
-    <w:p>
-      <w:pPr>
-        <w:pStyle w:val="Compact"/>
-        <w:numPr>
-          <w:ilvl w:val="0"/>
-          <w:numId w:val="1005"/>
-        </w:numPr>
-      </w:pPr>
-      <w:r>
-        <w:t xml:space="preserve">Built a multi-modal retrieval pipeline, leveraging CLIP and Sentence-BERT embeddings for image and text understanding, enhancing searchability by 40%.</w:t>
-      </w:r>
-    </w:p>
-    <w:p>
-      <w:pPr>
-        <w:pStyle w:val="Compact"/>
-        <w:numPr>
-          <w:ilvl w:val="0"/>
-          <w:numId w:val="1005"/>
-        </w:numPr>
-      </w:pPr>
-      <w:r>
-        <w:t xml:space="preserve">Built a high-throughput pipeline for batch &amp; incremental asset tagging using Kafka, Spark, and distributed deep learning inference.</w:t>
-      </w:r>
-    </w:p>
-    <w:bookmarkEnd w:id="25"/>
-    <w:bookmarkEnd w:id="26"/>
-    <w:bookmarkStart w:id="28" w:name="X71b90da7175cee9ab1010bbd75ad27314c76116"/>
-    <w:p>
-      <w:pPr>
-        <w:pStyle w:val="Heading3"/>
-      </w:pPr>
-      <w:r>
-        <w:t xml:space="preserve">Senior Data Scientist - Embibe</w:t>
-      </w:r>
-      <w:r>
-        <w:t xml:space="preserve"> </w:t>
-      </w:r>
-      <w:r>
-        <w:t xml:space="preserve">(May 2019 – Jan 2021)</w:t>
-      </w:r>
-    </w:p>
-    <w:bookmarkStart w:id="27" w:name="X14ab821c86a15a7eb7453d92fa88febf6825235"/>
-    <w:p>
-      <w:pPr>
-        <w:pStyle w:val="Heading4"/>
-      </w:pPr>
-      <w:r>
-        <w:t xml:space="preserve">Question Tagging and Topic Extraction System</w:t>
-      </w:r>
-    </w:p>
-    <w:p>
-      <w:pPr>
-        <w:pStyle w:val="Compact"/>
-        <w:numPr>
-          <w:ilvl w:val="0"/>
-          <w:numId w:val="1006"/>
-        </w:numPr>
-      </w:pPr>
-      <w:r>
-        <w:t xml:space="preserve">Designed and implemented an automated system to tag questions with subjects and extract relevant topics from text.</w:t>
-      </w:r>
-    </w:p>
-    <w:p>
-      <w:pPr>
-        <w:pStyle w:val="Compact"/>
-        <w:numPr>
-          <w:ilvl w:val="0"/>
-          <w:numId w:val="1006"/>
-        </w:numPr>
-      </w:pPr>
-      <w:r>
-        <w:t xml:space="preserve">Developed question tagging using both text and image content, enabling better content recommendation and search accuracy.</w:t>
-      </w:r>
-    </w:p>
-    <w:p>
-      <w:pPr>
-        <w:pStyle w:val="Compact"/>
-        <w:numPr>
-          <w:ilvl w:val="0"/>
-          <w:numId w:val="1006"/>
-        </w:numPr>
-      </w:pPr>
-      <w:r>
-        <w:t xml:space="preserve">Used BERT model for text embeddings extraction and Resnet based architecture for visual feature extraction.</w:t>
-      </w:r>
-    </w:p>
-    <w:bookmarkEnd w:id="27"/>
-    <w:bookmarkEnd w:id="28"/>
-    <w:bookmarkStart w:id="31" w:name="Xd007bc3e7254f62f7ad0f1e7722b47fa2fddee9"/>
-    <w:p>
-      <w:pPr>
-        <w:pStyle w:val="Heading3"/>
-      </w:pPr>
-      <w:r>
-        <w:t xml:space="preserve">Senior Data Scientist - ClipIndia</w:t>
-      </w:r>
-      <w:r>
-        <w:t xml:space="preserve"> </w:t>
-      </w:r>
-      <w:r>
-        <w:t xml:space="preserve">(Sep 2018 – Apr 2019)</w:t>
-      </w:r>
-    </w:p>
-    <w:bookmarkStart w:id="29" w:name="nsfw-video-classification"/>
-    <w:p>
-      <w:pPr>
-        <w:pStyle w:val="Heading4"/>
-      </w:pPr>
-      <w:r>
-        <w:t xml:space="preserve">NSFW Video Classification</w:t>
-      </w:r>
-    </w:p>
-    <w:p>
-      <w:pPr>
-        <w:pStyle w:val="Compact"/>
-        <w:numPr>
-          <w:ilvl w:val="0"/>
-          <w:numId w:val="1007"/>
-        </w:numPr>
-      </w:pPr>
-      <w:r>
-        <w:t xml:space="preserve">Implemented a classification system to identify and filter out inappropriate content, reducing NSFW content</w:t>
-      </w:r>
-    </w:p>
-    <w:p>
-      <w:pPr>
-        <w:pStyle w:val="Compact"/>
-        <w:numPr>
-          <w:ilvl w:val="0"/>
-          <w:numId w:val="1007"/>
-        </w:numPr>
-      </w:pPr>
-      <w:r>
-        <w:t xml:space="preserve">Developed a video classification system, reducing inappropriate content by 28%.</w:t>
-      </w:r>
-    </w:p>
-    <w:bookmarkEnd w:id="29"/>
-    <w:bookmarkStart w:id="30" w:name="video-asset-tagging"/>
-    <w:p>
-      <w:pPr>
-        <w:pStyle w:val="Heading4"/>
-      </w:pPr>
-      <w:r>
-        <w:t xml:space="preserve">Video Asset Tagging</w:t>
-      </w:r>
-    </w:p>
-    <w:p>
-      <w:pPr>
-        <w:pStyle w:val="Compact"/>
-        <w:numPr>
-          <w:ilvl w:val="0"/>
-          <w:numId w:val="1008"/>
-        </w:numPr>
-      </w:pPr>
-      <w:r>
-        <w:t xml:space="preserve">Developed a video asset tagging system to improve content discoverability and feed ranking.</w:t>
-      </w:r>
-    </w:p>
-    <w:p>
-      <w:pPr>
-        <w:pStyle w:val="Compact"/>
-        <w:numPr>
-          <w:ilvl w:val="0"/>
-          <w:numId w:val="1008"/>
-        </w:numPr>
-      </w:pPr>
-      <w:r>
-        <w:t xml:space="preserve">Enhanced content organization and searchability, increasing user engagement by 3%.</w:t>
-      </w:r>
-    </w:p>
-    <w:bookmarkEnd w:id="30"/>
-    <w:bookmarkEnd w:id="31"/>
-    <w:bookmarkStart w:id="33" w:name="X69779b265433201edcbb6142ec1a9b144fc8694"/>
-    <w:p>
-      <w:pPr>
-        <w:pStyle w:val="Heading3"/>
-      </w:pPr>
-      <w:r>
-        <w:t xml:space="preserve">Senior Data Scientist - Cogknit Semantics</w:t>
-      </w:r>
-      <w:r>
-        <w:t xml:space="preserve"> </w:t>
-      </w:r>
-      <w:r>
-        <w:t xml:space="preserve">(Sep 2015 – Sep 2018)</w:t>
-      </w:r>
-    </w:p>
-    <w:bookmarkStart w:id="32" w:name="Xe9962d98aa185d19331d026ed8f6b2c92a36476"/>
-    <w:p>
-      <w:pPr>
-        <w:pStyle w:val="Heading4"/>
-      </w:pPr>
-      <w:r>
-        <w:t xml:space="preserve">Digital catalogue misplaced product detection</w:t>
-      </w:r>
-    </w:p>
-    <w:p>
-      <w:pPr>
-        <w:pStyle w:val="Compact"/>
-        <w:numPr>
-          <w:ilvl w:val="0"/>
-          <w:numId w:val="1009"/>
-        </w:numPr>
-      </w:pPr>
-      <w:r>
-        <w:t xml:space="preserve">Developed a computer vision-based system to detect and correct misplaced products in an e-commerce catalog using CNN models.</w:t>
-      </w:r>
-    </w:p>
-    <w:p>
-      <w:pPr>
-        <w:pStyle w:val="Compact"/>
-        <w:numPr>
-          <w:ilvl w:val="0"/>
-          <w:numId w:val="1009"/>
-        </w:numPr>
-      </w:pPr>
-      <w:r>
-        <w:t xml:space="preserve">Identified and reorganized 12% of misplaced products, resulting in substantial reductions in incorrect placements.</w:t>
-      </w:r>
-    </w:p>
-    <w:bookmarkEnd w:id="32"/>
-    <w:bookmarkEnd w:id="33"/>
-    <w:bookmarkStart w:id="34" w:name="X5003e9462c62621044354b450e52d68e7d3c29c"/>
-    <w:p>
-      <w:pPr>
-        <w:pStyle w:val="Heading3"/>
-      </w:pPr>
-      <w:r>
-        <w:t xml:space="preserve">Sr. Research Analyst - Edureka</w:t>
-      </w:r>
-      <w:r>
-        <w:t xml:space="preserve"> </w:t>
-      </w:r>
-      <w:r>
-        <w:t xml:space="preserve">(Dec 2013 – Sep 2015)</w:t>
-      </w:r>
-    </w:p>
-    <w:p>
-      <w:pPr>
-        <w:pStyle w:val="Compact"/>
-        <w:numPr>
-          <w:ilvl w:val="0"/>
-          <w:numId w:val="1010"/>
-        </w:numPr>
-      </w:pPr>
-      <w:r>
-        <w:t xml:space="preserve">Led the initiative to create a comprehensive knowledge base, reducing the workload on the TA team and enhancing the overall efficiency of support and learning resources.</w:t>
-      </w:r>
-    </w:p>
-    <w:p>
-      <w:r>
-        <w:pict>
-          <v:rect style="width:0;height:1.5pt" o:hralign="center" o:hrstd="t" o:hr="t"/>
-        </w:pict>
-      </w:r>
-    </w:p>
-    <w:bookmarkEnd w:id="34"/>
-    <w:bookmarkEnd w:id="35"/>
-    <w:bookmarkStart w:id="36" w:name="education"/>
-    <w:p>
-      <w:pPr>
-        <w:pStyle w:val="Heading2"/>
-      </w:pPr>
-      <w:r>
-        <w:t xml:space="preserve">Education</w:t>
-      </w:r>
-    </w:p>
-    <w:p>
-      <w:pPr>
-        <w:pStyle w:val="Compact"/>
-        <w:numPr>
-          <w:ilvl w:val="0"/>
-          <w:numId w:val="1011"/>
-        </w:numPr>
-      </w:pPr>
-      <w:r>
-        <w:rPr>
-          <w:b/>
-          <w:bCs/>
-        </w:rPr>
-        <w:t xml:space="preserve">Bachelor in Computer Science</w:t>
-      </w:r>
-      <w:r>
-        <w:t xml:space="preserve">, Visvesvaraya Technological University (VTU), 2013.</w:t>
-      </w:r>
-    </w:p>
-    <w:p>
-      <w:r>
-        <w:pict>
-          <v:rect style="width:0;height:1.5pt" o:hralign="center" o:hrstd="t" o:hr="t"/>
-        </w:pict>
-      </w:r>
-    </w:p>
-    <w:bookmarkEnd w:id="36"/>
-    <w:bookmarkStart w:id="37" w:name="skills"/>
-    <w:p>
-      <w:pPr>
-        <w:pStyle w:val="Heading2"/>
-      </w:pPr>
-      <w:r>
-        <w:t xml:space="preserve">Skills</w:t>
-      </w:r>
-    </w:p>
-    <w:p>
-      <w:pPr>
-        <w:pStyle w:val="Compact"/>
-        <w:numPr>
-          <w:ilvl w:val="0"/>
-          <w:numId w:val="1012"/>
-        </w:numPr>
-      </w:pPr>
-      <w:r>
-        <w:rPr>
-          <w:b/>
-          <w:bCs/>
-        </w:rPr>
-        <w:t xml:space="preserve">Generative AI</w:t>
-      </w:r>
-      <w:r>
-        <w:t xml:space="preserve">: Advanced Prompt engineering, LLM app development, AI Agents, RAG, ChatGPT, Bert, LLAMA, CrewAI, LangChain</w:t>
-      </w:r>
-    </w:p>
-    <w:p>
-      <w:pPr>
-        <w:pStyle w:val="Compact"/>
-        <w:numPr>
-          <w:ilvl w:val="0"/>
-          <w:numId w:val="1012"/>
-        </w:numPr>
-      </w:pPr>
-      <w:r>
-        <w:rPr>
-          <w:b/>
-          <w:bCs/>
-        </w:rPr>
-        <w:t xml:space="preserve">Search Systems</w:t>
-      </w:r>
-      <w:r>
-        <w:t xml:space="preserve">: Elasticsearch, Milvus, FAISS</w:t>
-      </w:r>
-    </w:p>
-    <w:p>
-      <w:pPr>
-        <w:pStyle w:val="Compact"/>
-        <w:numPr>
-          <w:ilvl w:val="0"/>
-          <w:numId w:val="1012"/>
-        </w:numPr>
-      </w:pPr>
-      <w:r>
-        <w:rPr>
-          <w:b/>
-          <w:bCs/>
-        </w:rPr>
-        <w:t xml:space="preserve">Computer Vision</w:t>
-      </w:r>
-      <w:r>
-        <w:t xml:space="preserve">: Object detection, image classification, image segmentation</w:t>
-      </w:r>
-    </w:p>
-    <w:p>
-      <w:pPr>
-        <w:pStyle w:val="Compact"/>
-        <w:numPr>
-          <w:ilvl w:val="0"/>
-          <w:numId w:val="1012"/>
-        </w:numPr>
-      </w:pPr>
-      <w:r>
-        <w:rPr>
-          <w:b/>
-          <w:bCs/>
-        </w:rPr>
-        <w:t xml:space="preserve">NLP</w:t>
-      </w:r>
-      <w:r>
-        <w:t xml:space="preserve">: Text classification, topic modeling, Intent classification</w:t>
+        <w:t xml:space="preserve">: Text classification, topic modeling, intent classification</w:t>
       </w:r>
     </w:p>
     <w:p>
@@ -862,7 +686,7 @@
         <w:t xml:space="preserve">Applied ML</w:t>
       </w:r>
       <w:r>
-        <w:t xml:space="preserve">: Model training, optimisation and deployment at scale, Algorithm research and selection</w:t>
+        <w:t xml:space="preserve">: Model training, optimization, deployment at scale, algorithm research</w:t>
       </w:r>
     </w:p>
     <w:p>
@@ -919,7 +743,7 @@
         <w:t xml:space="preserve">MLOps</w:t>
       </w:r>
       <w:r>
-        <w:t xml:space="preserve">: Git, CI/CD, MLflow, containerization (Docker), APIs</w:t>
+        <w:t xml:space="preserve">: Git, CI/CD, MLflow, Docker, APIs</w:t>
       </w:r>
     </w:p>
     <w:p>
@@ -967,7 +791,7 @@
         </w:numPr>
       </w:pPr>
       <w:r>
-        <w:t xml:space="preserve">Poster presentation on "Domain Adaptation of Image Caption Model for Video Descriptions" at AI &amp; Deep Learning Conference (GTC 2018, NVIDIA).</w:t>
+        <w:t xml:space="preserve">Poster: "Domain Adaptation of Image Caption Model for Video Descriptions" at AI &amp; Deep Learning Conference (GTC 2018, NVIDIA).</w:t>
       </w:r>
     </w:p>
     <w:bookmarkEnd w:id="38"/>

</xml_diff>